<commit_message>
docs(manual): rellenar contacto de soporte
Co-Authored-By: Claude Sonnet 4.6 <noreply@anthropic.com>
</commit_message>
<xml_diff>
--- a/docs/MANUAL_TECNICO.docx
+++ b/docs/MANUAL_TECNICO.docx
@@ -15278,16 +15278,7 @@
         </w:numPr>
       </w:pPr>
       <w:r>
-        <w:t xml:space="preserve">WhatsApp:</w:t>
-      </w:r>
-      <w:r>
-        <w:t xml:space="preserve"> </w:t>
-      </w:r>
-      <w:r>
-        <w:rPr>
-          <w:rStyle w:val="VerbatimChar"/>
-        </w:rPr>
-        <w:t xml:space="preserve">[PENDIENTE_ALEXIS]</w:t>
+        <w:t xml:space="preserve">WhatsApp: +522211747662</w:t>
       </w:r>
     </w:p>
     <w:p>
@@ -15299,16 +15290,7 @@
         </w:numPr>
       </w:pPr>
       <w:r>
-        <w:t xml:space="preserve">Email:</w:t>
-      </w:r>
-      <w:r>
-        <w:t xml:space="preserve"> </w:t>
-      </w:r>
-      <w:r>
-        <w:rPr>
-          <w:rStyle w:val="VerbatimChar"/>
-        </w:rPr>
-        <w:t xml:space="preserve">[PENDIENTE_ALEXIS]</w:t>
+        <w:t xml:space="preserve">Email: alexis.schiavon@gmail.com</w:t>
       </w:r>
     </w:p>
     <w:p>

</xml_diff>